<commit_message>
Shorten abstract findings/conclusion; add experimental+applied future work
Abstract (FA+EN): Findings paragraph condensed from ~16 lines to 4
sentences (kept only headline numbers: overshoot 1.115, V-A synergy
26x, Gaussian shock 2.5x, DQM/Newmark efficiency); Conclusion from
~12 lines to 3 sentences. Detailed numbers remain in Chapter 4/5.

Chapter 5 (FA+EN) SS5-5: added two future-work items - experimental
validation (fabricate/test physical specimens under real thermal
shock, measure relaxation time tau_0 directly) and applied design
guidance (engineering selection chart from the V-A synergy finding,
industrial-geometry case study).
</commit_message>
<xml_diff>
--- a/claude/thesis_chapter/ABSTRACT_EN.docx
+++ b/claude/thesis_chapter/ABSTRACT_EN.docx
@@ -140,37 +140,19 @@
         <w:t xml:space="preserve"> </w:t>
       </w:r>
       <w:r>
-        <w:t xml:space="preserve">Owing to the finite propagation speed of the thermal wave in the</w:t>
-      </w:r>
-      <w:r>
-        <w:t xml:space="preserve"> </w:t>
-      </w:r>
-      <w:r>
-        <w:t xml:space="preserve">Lord-Shulman theory, the dimensionless mid-point temperature can overshoot (exceed unity); in the</w:t>
-      </w:r>
-      <w:r>
-        <w:t xml:space="preserve"> </w:t>
-      </w:r>
-      <w:r>
-        <w:t xml:space="preserve">reference case it reaches about 0.926 without exceeding unity, whereas a genuine</w:t>
-      </w:r>
-      <w:r>
-        <w:t xml:space="preserve"> </w:t>
-      </w:r>
-      <w:r>
-        <w:t xml:space="preserve">overshoot appears in specific cases — for example V-type porosity (1.109) and high</w:t>
-      </w:r>
-      <w:r>
-        <w:t xml:space="preserve"> </w:t>
-      </w:r>
-      <w:r>
-        <w:t xml:space="preserve">graphene loading (up to 1.115) — and the temperature</w:t>
-      </w:r>
-      <w:r>
-        <w:t xml:space="preserve"> </w:t>
-      </w:r>
-      <w:r>
-        <w:t xml:space="preserve">history exhibits a</w:t>
+        <w:t xml:space="preserve">Owing to the finite thermal-wave speed in the Lord-Shulman theory, the</w:t>
+      </w:r>
+      <w:r>
+        <w:t xml:space="preserve"> </w:t>
+      </w:r>
+      <w:r>
+        <w:t xml:space="preserve">mid-wall temperature can overshoot the driving value (up to 1.115 at high graphene</w:t>
+      </w:r>
+      <w:r>
+        <w:t xml:space="preserve"> </w:t>
+      </w:r>
+      <w:r>
+        <w:t xml:space="preserve">loading), and the temperature history shows the characteristic</w:t>
       </w:r>
       <w:r>
         <w:t xml:space="preserve"> </w:t>
@@ -182,109 +164,61 @@
         <w:t xml:space="preserve"> </w:t>
       </w:r>
       <w:r>
-        <w:t xml:space="preserve">pattern arising from the back-and-forth travel and</w:t>
-      </w:r>
-      <w:r>
-        <w:t xml:space="preserve"> </w:t>
-      </w:r>
-      <w:r>
-        <w:t xml:space="preserve">reflection of the wave. Placing the conductive graphene platelets at the hot inner</w:t>
-      </w:r>
-      <w:r>
-        <w:t xml:space="preserve"> </w:t>
-      </w:r>
-      <w:r>
-        <w:t xml:space="preserve">surface (pattern V) reduced the peak temperature by about 29 percent and the</w:t>
-      </w:r>
-      <w:r>
-        <w:t xml:space="preserve"> </w:t>
-      </w:r>
-      <w:r>
-        <w:t xml:space="preserve">inner-surface circumferential (hoop) stress by a factor of about 3, whereas</w:t>
-      </w:r>
-      <w:r>
-        <w:t xml:space="preserve"> </w:t>
-      </w:r>
-      <w:r>
-        <w:t xml:space="preserve">pattern A exhibited the worst behavior in all three quantities of temperature,</w:t>
-      </w:r>
-      <w:r>
-        <w:t xml:space="preserve"> </w:t>
-      </w:r>
-      <w:r>
-        <w:t xml:space="preserve">stress, and displacement. Concentrating the porosity at the outer surface (pattern</w:t>
-      </w:r>
-      <w:r>
-        <w:t xml:space="preserve"> </w:t>
-      </w:r>
-      <w:r>
-        <w:t xml:space="preserve">A) acted as a thermal barrier and reduced the outer-surface temperature by a factor of</w:t>
-      </w:r>
-      <w:r>
-        <w:t xml:space="preserve"> </w:t>
-      </w:r>
-      <w:r>
-        <w:t xml:space="preserve">about 8. Combining V graphene with A porosity synergistically reduced the</w:t>
-      </w:r>
-      <w:r>
-        <w:t xml:space="preserve"> </w:t>
-      </w:r>
-      <w:r>
-        <w:t xml:space="preserve">outer-surface temperature by a factor of about 26. The percolation threshold occurred</w:t>
-      </w:r>
-      <w:r>
-        <w:t xml:space="preserve"> </w:t>
-      </w:r>
-      <w:r>
-        <w:t xml:space="preserve">at a weight fraction of about 1 percent, and increasing the graphene up to 8 percent</w:t>
-      </w:r>
-      <w:r>
-        <w:t xml:space="preserve"> </w:t>
-      </w:r>
-      <w:r>
-        <w:t xml:space="preserve">roughly doubled the thermal stresses. At the reference weight fraction both platelet aspect ratios have a second-order</w:t>
-      </w:r>
-      <w:r>
-        <w:t xml:space="preserve"> </w:t>
-      </w:r>
-      <w:r>
-        <w:t xml:space="preserve">effect (the width-to-thickness ratio being the weakest); the width-to-thickness</w:t>
-      </w:r>
-      <w:r>
-        <w:t xml:space="preserve"> </w:t>
-      </w:r>
-      <w:r>
-        <w:t xml:space="preserve">ratio becomes the dominant reinforcement lever only at high graphene loading. The fully coupled solution damped the thermal wave by about</w:t>
-      </w:r>
-      <w:r>
-        <w:t xml:space="preserve"> </w:t>
-      </w:r>
-      <w:r>
-        <w:t xml:space="preserve">1 percent, and under Gaussian-pulse loading the classical theory underestimated the</w:t>
-      </w:r>
-      <w:r>
-        <w:t xml:space="preserve"> </w:t>
-      </w:r>
-      <w:r>
-        <w:t xml:space="preserve">peak temperature by about 2.5 times. Methodologically, the Newmark method offered the</w:t>
-      </w:r>
-      <w:r>
-        <w:t xml:space="preserve"> </w:t>
-      </w:r>
-      <w:r>
-        <w:t xml:space="preserve">best accuracy-to-cost ratio among the six integrators tested, and the differential</w:t>
-      </w:r>
-      <w:r>
-        <w:t xml:space="preserve"> </w:t>
-      </w:r>
-      <w:r>
-        <w:t xml:space="preserve">quadrature method reached the desired accuracy with about one-fifteenth of the nodes</w:t>
-      </w:r>
-      <w:r>
-        <w:t xml:space="preserve"> </w:t>
-      </w:r>
-      <w:r>
-        <w:t xml:space="preserve">of the finite-difference and linear finite-element methods.</w:t>
+        <w:t xml:space="preserve">pattern</w:t>
+      </w:r>
+      <w:r>
+        <w:t xml:space="preserve"> </w:t>
+      </w:r>
+      <w:r>
+        <w:t xml:space="preserve">produced by wave reflection. Placing conductive graphene at the hot inner surface</w:t>
+      </w:r>
+      <w:r>
+        <w:t xml:space="preserve"> </w:t>
+      </w:r>
+      <w:r>
+        <w:t xml:space="preserve">(pattern V) together with insulating porosity at the cold outer surface (pattern A)</w:t>
+      </w:r>
+      <w:r>
+        <w:t xml:space="preserve"> </w:t>
+      </w:r>
+      <w:r>
+        <w:t xml:space="preserve">acts synergistically, reducing the outer-surface temperature by about 26-fold — the</w:t>
+      </w:r>
+      <w:r>
+        <w:t xml:space="preserve"> </w:t>
+      </w:r>
+      <w:r>
+        <w:t xml:space="preserve">design configuration recommended by this work for thermal-protection applications.</w:t>
+      </w:r>
+      <w:r>
+        <w:t xml:space="preserve"> </w:t>
+      </w:r>
+      <w:r>
+        <w:t xml:space="preserve">Under a Gaussian shock pulse, classical Fourier theory underestimates the peak</w:t>
+      </w:r>
+      <w:r>
+        <w:t xml:space="preserve"> </w:t>
+      </w:r>
+      <w:r>
+        <w:t xml:space="preserve">temperature by about 2.5 times, a strong argument for the generalized theory.</w:t>
+      </w:r>
+      <w:r>
+        <w:t xml:space="preserve"> </w:t>
+      </w:r>
+      <w:r>
+        <w:t xml:space="preserve">Methodologically, the differential-quadrature/Newmark combination reaches the desired</w:t>
+      </w:r>
+      <w:r>
+        <w:t xml:space="preserve"> </w:t>
+      </w:r>
+      <w:r>
+        <w:t xml:space="preserve">accuracy at low computational cost, needing about one-fifteenth of the nodes required</w:t>
+      </w:r>
+      <w:r>
+        <w:t xml:space="preserve"> </w:t>
+      </w:r>
+      <w:r>
+        <w:t xml:space="preserve">by competing methods.</w:t>
       </w:r>
     </w:p>
     <w:p>
@@ -302,91 +236,49 @@
         <w:t xml:space="preserve"> </w:t>
       </w:r>
       <w:r>
-        <w:t xml:space="preserve">The results show that, for an accurate analysis of the transient</w:t>
-      </w:r>
-      <w:r>
-        <w:t xml:space="preserve"> </w:t>
-      </w:r>
-      <w:r>
-        <w:t xml:space="preserve">thermal shock in these cylinders, applying the generalized Lord-Shulman theory is</w:t>
-      </w:r>
-      <w:r>
-        <w:t xml:space="preserve"> </w:t>
-      </w:r>
-      <w:r>
-        <w:t xml:space="preserve">essential, because the classical Fourier theory severely underestimates the</w:t>
-      </w:r>
-      <w:r>
-        <w:t xml:space="preserve"> </w:t>
-      </w:r>
-      <w:r>
-        <w:t xml:space="preserve">transient stresses, particularly under impulsive loading. From a design standpoint,</w:t>
-      </w:r>
-      <w:r>
-        <w:t xml:space="preserve"> </w:t>
-      </w:r>
-      <w:r>
-        <w:t xml:space="preserve">aligning the conductive graphene pattern with the hot surface (V) and the insulating</w:t>
-      </w:r>
-      <w:r>
-        <w:t xml:space="preserve"> </w:t>
-      </w:r>
-      <w:r>
-        <w:t xml:space="preserve">porosity pattern with the cold surface (A) provides the most favorable thermal</w:t>
-      </w:r>
-      <w:r>
-        <w:t xml:space="preserve"> </w:t>
-      </w:r>
-      <w:r>
-        <w:t xml:space="preserve">behavior with the least stress penalty, and it is introduced as the recommended</w:t>
-      </w:r>
-      <w:r>
-        <w:t xml:space="preserve"> </w:t>
-      </w:r>
-      <w:r>
-        <w:t xml:space="preserve">configuration for thermal-protection applications. Nevertheless, because the pairing</w:t>
-      </w:r>
-      <w:r>
-        <w:t xml:space="preserve"> </w:t>
-      </w:r>
-      <w:r>
-        <w:t xml:space="preserve">of the two patterns can be either synergistic or neutralizing, and combinations such</w:t>
-      </w:r>
-      <w:r>
-        <w:t xml:space="preserve"> </w:t>
-      </w:r>
-      <w:r>
-        <w:t xml:space="preserve">as X graphene with V porosity produce the maximum stress, the selection of patterns</w:t>
-      </w:r>
-      <w:r>
-        <w:t xml:space="preserve"> </w:t>
-      </w:r>
-      <w:r>
-        <w:t xml:space="preserve">must be assessed simultaneously from the standpoints of both temperature and stress.</w:t>
-      </w:r>
-      <w:r>
-        <w:t xml:space="preserve"> </w:t>
-      </w:r>
-      <w:r>
-        <w:t xml:space="preserve">Adding graphene beyond the percolation threshold yields a limited thermal benefit but</w:t>
-      </w:r>
-      <w:r>
-        <w:t xml:space="preserve"> </w:t>
-      </w:r>
-      <w:r>
-        <w:t xml:space="preserve">an increasing stress penalty and must be undertaken with caution. Overall, the</w:t>
-      </w:r>
-      <w:r>
-        <w:t xml:space="preserve"> </w:t>
-      </w:r>
-      <w:r>
-        <w:t xml:space="preserve">layerwise differential quadrature method together with Newmark integration provides</w:t>
-      </w:r>
-      <w:r>
-        <w:t xml:space="preserve"> </w:t>
-      </w:r>
-      <w:r>
-        <w:t xml:space="preserve">an efficient, convergent, and verified tool for such coupled thermoelastic analyses.</w:t>
+        <w:t xml:space="preserve">The results show that accurately analyzing transient thermal shock in</w:t>
+      </w:r>
+      <w:r>
+        <w:t xml:space="preserve"> </w:t>
+      </w:r>
+      <w:r>
+        <w:t xml:space="preserve">these cylinders requires the generalized Lord-Shulman theory, since the classical</w:t>
+      </w:r>
+      <w:r>
+        <w:t xml:space="preserve"> </w:t>
+      </w:r>
+      <w:r>
+        <w:t xml:space="preserve">theory severely underestimates transient stresses. From a design standpoint, aligning</w:t>
+      </w:r>
+      <w:r>
+        <w:t xml:space="preserve"> </w:t>
+      </w:r>
+      <w:r>
+        <w:t xml:space="preserve">the graphene and porosity patterns (the V-A combination) gives the most favorable</w:t>
+      </w:r>
+      <w:r>
+        <w:t xml:space="preserve"> </w:t>
+      </w:r>
+      <w:r>
+        <w:t xml:space="preserve">thermal behavior at the lowest stress penalty, though pattern selection must weigh</w:t>
+      </w:r>
+      <w:r>
+        <w:t xml:space="preserve"> </w:t>
+      </w:r>
+      <w:r>
+        <w:t xml:space="preserve">both temperature and stress together. The layerwise differential quadrature method</w:t>
+      </w:r>
+      <w:r>
+        <w:t xml:space="preserve"> </w:t>
+      </w:r>
+      <w:r>
+        <w:t xml:space="preserve">with Newmark integration provides an efficient, verified tool for such coupled</w:t>
+      </w:r>
+      <w:r>
+        <w:t xml:space="preserve"> </w:t>
+      </w:r>
+      <w:r>
+        <w:t xml:space="preserve">thermoelastic analyses.</w:t>
       </w:r>
     </w:p>
     <w:p>
@@ -1192,7 +1084,7 @@
       <w:color w:themeColor="accent1" w:themeShade="BF" w:val="365F91"/>
     </w:rPr>
   </w:style>
-  <w:style w:type="paragraph" w:customStyle="1" w:styleId="SourceCode">
+  <w:style w:customStyle="1" w:styleId="SourceCode" w:type="paragraph">
     <w:name w:val="Source Code"/>
     <w:basedOn w:val="Normal"/>
     <w:link w:val="VerbatimChar"/>
@@ -1200,7 +1092,7 @@
       <w:wordWrap w:val="off"/>
     </w:pPr>
   </w:style>
-  <w:style w:type="character" w:customStyle="1" w:styleId="KeywordTok">
+  <w:style w:customStyle="1" w:styleId="KeywordTok" w:type="character">
     <w:name w:val="KeywordTok"/>
     <w:basedOn w:val="VerbatimChar"/>
     <w:rPr>
@@ -1208,77 +1100,77 @@
       <w:color w:val="007020"/>
     </w:rPr>
   </w:style>
-  <w:style w:type="character" w:customStyle="1" w:styleId="DataTypeTok">
+  <w:style w:customStyle="1" w:styleId="DataTypeTok" w:type="character">
     <w:name w:val="DataTypeTok"/>
     <w:basedOn w:val="VerbatimChar"/>
     <w:rPr>
       <w:color w:val="902000"/>
     </w:rPr>
   </w:style>
-  <w:style w:type="character" w:customStyle="1" w:styleId="DecValTok">
+  <w:style w:customStyle="1" w:styleId="DecValTok" w:type="character">
     <w:name w:val="DecValTok"/>
     <w:basedOn w:val="VerbatimChar"/>
     <w:rPr>
       <w:color w:val="40a070"/>
     </w:rPr>
   </w:style>
-  <w:style w:type="character" w:customStyle="1" w:styleId="BaseNTok">
+  <w:style w:customStyle="1" w:styleId="BaseNTok" w:type="character">
     <w:name w:val="BaseNTok"/>
     <w:basedOn w:val="VerbatimChar"/>
     <w:rPr>
       <w:color w:val="40a070"/>
     </w:rPr>
   </w:style>
-  <w:style w:type="character" w:customStyle="1" w:styleId="FloatTok">
+  <w:style w:customStyle="1" w:styleId="FloatTok" w:type="character">
     <w:name w:val="FloatTok"/>
     <w:basedOn w:val="VerbatimChar"/>
     <w:rPr>
       <w:color w:val="40a070"/>
     </w:rPr>
   </w:style>
-  <w:style w:type="character" w:customStyle="1" w:styleId="ConstantTok">
+  <w:style w:customStyle="1" w:styleId="ConstantTok" w:type="character">
     <w:name w:val="ConstantTok"/>
     <w:basedOn w:val="VerbatimChar"/>
     <w:rPr>
       <w:color w:val="880000"/>
     </w:rPr>
   </w:style>
-  <w:style w:type="character" w:customStyle="1" w:styleId="CharTok">
+  <w:style w:customStyle="1" w:styleId="CharTok" w:type="character">
     <w:name w:val="CharTok"/>
     <w:basedOn w:val="VerbatimChar"/>
     <w:rPr>
       <w:color w:val="4070a0"/>
     </w:rPr>
   </w:style>
-  <w:style w:type="character" w:customStyle="1" w:styleId="SpecialCharTok">
+  <w:style w:customStyle="1" w:styleId="SpecialCharTok" w:type="character">
     <w:name w:val="SpecialCharTok"/>
     <w:basedOn w:val="VerbatimChar"/>
     <w:rPr>
       <w:color w:val="4070a0"/>
     </w:rPr>
   </w:style>
-  <w:style w:type="character" w:customStyle="1" w:styleId="StringTok">
+  <w:style w:customStyle="1" w:styleId="StringTok" w:type="character">
     <w:name w:val="StringTok"/>
     <w:basedOn w:val="VerbatimChar"/>
     <w:rPr>
       <w:color w:val="4070a0"/>
     </w:rPr>
   </w:style>
-  <w:style w:type="character" w:customStyle="1" w:styleId="VerbatimStringTok">
+  <w:style w:customStyle="1" w:styleId="VerbatimStringTok" w:type="character">
     <w:name w:val="VerbatimStringTok"/>
     <w:basedOn w:val="VerbatimChar"/>
     <w:rPr>
       <w:color w:val="4070a0"/>
     </w:rPr>
   </w:style>
-  <w:style w:type="character" w:customStyle="1" w:styleId="SpecialStringTok">
+  <w:style w:customStyle="1" w:styleId="SpecialStringTok" w:type="character">
     <w:name w:val="SpecialStringTok"/>
     <w:basedOn w:val="VerbatimChar"/>
     <w:rPr>
       <w:color w:val="bb6688"/>
     </w:rPr>
   </w:style>
-  <w:style w:type="character" w:customStyle="1" w:styleId="ImportTok">
+  <w:style w:customStyle="1" w:styleId="ImportTok" w:type="character">
     <w:name w:val="ImportTok"/>
     <w:basedOn w:val="VerbatimChar"/>
     <w:rPr>
@@ -1286,7 +1178,7 @@
       <w:color w:val="008000"/>
     </w:rPr>
   </w:style>
-  <w:style w:type="character" w:customStyle="1" w:styleId="CommentTok">
+  <w:style w:customStyle="1" w:styleId="CommentTok" w:type="character">
     <w:name w:val="CommentTok"/>
     <w:basedOn w:val="VerbatimChar"/>
     <w:rPr>
@@ -1294,7 +1186,7 @@
       <w:color w:val="60a0b0"/>
     </w:rPr>
   </w:style>
-  <w:style w:type="character" w:customStyle="1" w:styleId="DocumentationTok">
+  <w:style w:customStyle="1" w:styleId="DocumentationTok" w:type="character">
     <w:name w:val="DocumentationTok"/>
     <w:basedOn w:val="VerbatimChar"/>
     <w:rPr>
@@ -1302,7 +1194,7 @@
       <w:color w:val="ba2121"/>
     </w:rPr>
   </w:style>
-  <w:style w:type="character" w:customStyle="1" w:styleId="AnnotationTok">
+  <w:style w:customStyle="1" w:styleId="AnnotationTok" w:type="character">
     <w:name w:val="AnnotationTok"/>
     <w:basedOn w:val="VerbatimChar"/>
     <w:rPr>
@@ -1311,7 +1203,7 @@
       <w:color w:val="60a0b0"/>
     </w:rPr>
   </w:style>
-  <w:style w:type="character" w:customStyle="1" w:styleId="CommentVarTok">
+  <w:style w:customStyle="1" w:styleId="CommentVarTok" w:type="character">
     <w:name w:val="CommentVarTok"/>
     <w:basedOn w:val="VerbatimChar"/>
     <w:rPr>
@@ -1320,28 +1212,28 @@
       <w:color w:val="60a0b0"/>
     </w:rPr>
   </w:style>
-  <w:style w:type="character" w:customStyle="1" w:styleId="OtherTok">
+  <w:style w:customStyle="1" w:styleId="OtherTok" w:type="character">
     <w:name w:val="OtherTok"/>
     <w:basedOn w:val="VerbatimChar"/>
     <w:rPr>
       <w:color w:val="007020"/>
     </w:rPr>
   </w:style>
-  <w:style w:type="character" w:customStyle="1" w:styleId="FunctionTok">
+  <w:style w:customStyle="1" w:styleId="FunctionTok" w:type="character">
     <w:name w:val="FunctionTok"/>
     <w:basedOn w:val="VerbatimChar"/>
     <w:rPr>
       <w:color w:val="06287e"/>
     </w:rPr>
   </w:style>
-  <w:style w:type="character" w:customStyle="1" w:styleId="VariableTok">
+  <w:style w:customStyle="1" w:styleId="VariableTok" w:type="character">
     <w:name w:val="VariableTok"/>
     <w:basedOn w:val="VerbatimChar"/>
     <w:rPr>
       <w:color w:val="19177c"/>
     </w:rPr>
   </w:style>
-  <w:style w:type="character" w:customStyle="1" w:styleId="ControlFlowTok">
+  <w:style w:customStyle="1" w:styleId="ControlFlowTok" w:type="character">
     <w:name w:val="ControlFlowTok"/>
     <w:basedOn w:val="VerbatimChar"/>
     <w:rPr>
@@ -1349,45 +1241,45 @@
       <w:color w:val="007020"/>
     </w:rPr>
   </w:style>
-  <w:style w:type="character" w:customStyle="1" w:styleId="OperatorTok">
+  <w:style w:customStyle="1" w:styleId="OperatorTok" w:type="character">
     <w:name w:val="OperatorTok"/>
     <w:basedOn w:val="VerbatimChar"/>
     <w:rPr>
       <w:color w:val="666666"/>
     </w:rPr>
   </w:style>
-  <w:style w:type="character" w:customStyle="1" w:styleId="BuiltInTok">
+  <w:style w:customStyle="1" w:styleId="BuiltInTok" w:type="character">
     <w:name w:val="BuiltInTok"/>
     <w:basedOn w:val="VerbatimChar"/>
     <w:rPr>
       <w:color w:val="008000"/>
     </w:rPr>
   </w:style>
-  <w:style w:type="character" w:customStyle="1" w:styleId="ExtensionTok">
+  <w:style w:customStyle="1" w:styleId="ExtensionTok" w:type="character">
     <w:name w:val="ExtensionTok"/>
     <w:basedOn w:val="VerbatimChar"/>
     <w:rPr/>
   </w:style>
-  <w:style w:type="character" w:customStyle="1" w:styleId="PreprocessorTok">
+  <w:style w:customStyle="1" w:styleId="PreprocessorTok" w:type="character">
     <w:name w:val="PreprocessorTok"/>
     <w:basedOn w:val="VerbatimChar"/>
     <w:rPr>
       <w:color w:val="bc7a00"/>
     </w:rPr>
   </w:style>
-  <w:style w:type="character" w:customStyle="1" w:styleId="AttributeTok">
+  <w:style w:customStyle="1" w:styleId="AttributeTok" w:type="character">
     <w:name w:val="AttributeTok"/>
     <w:basedOn w:val="VerbatimChar"/>
     <w:rPr>
       <w:color w:val="7d9029"/>
     </w:rPr>
   </w:style>
-  <w:style w:type="character" w:customStyle="1" w:styleId="RegionMarkerTok">
+  <w:style w:customStyle="1" w:styleId="RegionMarkerTok" w:type="character">
     <w:name w:val="RegionMarkerTok"/>
     <w:basedOn w:val="VerbatimChar"/>
     <w:rPr/>
   </w:style>
-  <w:style w:type="character" w:customStyle="1" w:styleId="InformationTok">
+  <w:style w:customStyle="1" w:styleId="InformationTok" w:type="character">
     <w:name w:val="InformationTok"/>
     <w:basedOn w:val="VerbatimChar"/>
     <w:rPr>
@@ -1396,7 +1288,7 @@
       <w:color w:val="60a0b0"/>
     </w:rPr>
   </w:style>
-  <w:style w:type="character" w:customStyle="1" w:styleId="WarningTok">
+  <w:style w:customStyle="1" w:styleId="WarningTok" w:type="character">
     <w:name w:val="WarningTok"/>
     <w:basedOn w:val="VerbatimChar"/>
     <w:rPr>
@@ -1405,7 +1297,7 @@
       <w:color w:val="60a0b0"/>
     </w:rPr>
   </w:style>
-  <w:style w:type="character" w:customStyle="1" w:styleId="AlertTok">
+  <w:style w:customStyle="1" w:styleId="AlertTok" w:type="character">
     <w:name w:val="AlertTok"/>
     <w:basedOn w:val="VerbatimChar"/>
     <w:rPr>
@@ -1413,7 +1305,7 @@
       <w:color w:val="ff0000"/>
     </w:rPr>
   </w:style>
-  <w:style w:type="character" w:customStyle="1" w:styleId="ErrorTok">
+  <w:style w:customStyle="1" w:styleId="ErrorTok" w:type="character">
     <w:name w:val="ErrorTok"/>
     <w:basedOn w:val="VerbatimChar"/>
     <w:rPr>
@@ -1421,7 +1313,7 @@
       <w:color w:val="ff0000"/>
     </w:rPr>
   </w:style>
-  <w:style w:type="character" w:customStyle="1" w:styleId="NormalTok">
+  <w:style w:customStyle="1" w:styleId="NormalTok" w:type="character">
     <w:name w:val="NormalTok"/>
     <w:basedOn w:val="VerbatimChar"/>
     <w:rPr/>

</xml_diff>